<commit_message>
All activities: Physical % complete type (project default too)
Co-Authored-By: Claude Sonnet 5.5 <noreply@anthropic.com>
Claude-Session: https://claude.ai/code/session_01DZdGPWRxvKXCnMyT6qFPZb
</commit_message>
<xml_diff>
--- a/p6/SAR_Schedule_Narrative.docx
+++ b/p6/SAR_Schedule_Narrative.docx
@@ -4055,7 +4055,7 @@
               <w:rPr>
                 <w:sz w:val="19"/>
               </w:rPr>
-              <w:t>Activity cost. Total SAR 62,000,000. Not counted in Units % complete.</w:t>
+              <w:t>Activity cost. Total SAR 62,000,000.</w:t>
             </w:r>
           </w:p>
         </w:tc>
@@ -4099,7 +4099,7 @@
               <w:rPr>
                 <w:sz w:val="19"/>
               </w:rPr>
-              <w:t>Progress points. 100,000 points = 100%. Price 0. Drives Units % complete and the progress S-curve.</w:t>
+              <w:t>Progress points. 100,000 points = 100%. Price 0. Carries the progress weight for the progress S-curve. All activities use Physical % complete.</w:t>
             </w:r>
           </w:p>
         </w:tc>

</xml_diff>

<commit_message>
Resources: PROG-WT carries SAR value at price 1, COST-SAR price 0 (EV/CPI/SPI in SAR on progress distribution)
Co-Authored-By: Claude Sonnet 5.5 <noreply@anthropic.com>
Claude-Session: https://claude.ai/code/session_01DZdGPWRxvKXCnMyT6qFPZb
</commit_message>
<xml_diff>
--- a/p6/SAR_Schedule_Narrative.docx
+++ b/p6/SAR_Schedule_Narrative.docx
@@ -4055,7 +4055,7 @@
               <w:rPr>
                 <w:sz w:val="19"/>
               </w:rPr>
-              <w:t>Activity cost. Total SAR 62,000,000.</w:t>
+              <w:t>Contract cost quantity in SAR. Price 0. Total 62,000,000 SAR.</w:t>
             </w:r>
           </w:p>
         </w:tc>
@@ -4099,13 +4099,21 @@
               <w:rPr>
                 <w:sz w:val="19"/>
               </w:rPr>
-              <w:t>Progress points. 100,000 points = 100%. Price 0. Carries the progress weight for the progress S-curve. All activities use Physical % complete.</w:t>
+              <w:t>Progress value in SAR (progress share x 62,000,000). Price 1, so it carries the budget cost. All activities use Physical % complete.</w:t>
             </w:r>
           </w:p>
         </w:tc>
       </w:tr>
     </w:tbl>
     <w:p/>
+    <w:p>
+      <w:r>
+        <w:rPr>
+          <w:b w:val="0"/>
+        </w:rPr>
+        <w:t>Because PROG-WT has price 1 and COST-SAR has price 0, the P6 budget, earned value, CPI and SPI are all in SAR on the fair EPC progress distribution. To view the contract payment-condition cost instead, swap the two prices (COST-SAR 1, PROG-WT 0).</w:t>
+      </w:r>
+    </w:p>
     <w:p>
       <w:r>
         <w:rPr>

</xml_diff>